<commit_message>
Remove GitHub profile links from resume
Keep original email and phone; drop the github.com/JrKrishh header link
and per-project repo links pending a different git profile.

Co-Authored-By: Claude Fable 5 <noreply@anthropic.com>
Claude-Session: https://claude.ai/code/session_01MP9tXey6XauUtHmYxv5Guj
</commit_message>
<xml_diff>
--- a/resume/YOGANAND_AI_ENGINEER_RESUME.docx
+++ b/resume/YOGANAND_AI_ENGINEER_RESUME.docx
@@ -51,27 +51,7 @@
         </w:rPr>
         <w:t xml:space="preserve">yogini.nand@gmail.com   ·   +91-80120 70015   ·   </w:t>
       </w:r>
-      <w:hyperlink w:history="1" r:id="rIdnbeojxebyq2wqzv3hakbm">
-        <w:r>
-          <w:rPr>
-            <w:rFonts w:ascii="Calibri" w:cs="Calibri" w:eastAsia="Calibri" w:hAnsi="Calibri"/>
-            <w:color w:val="0E7490"/>
-            <w:sz w:val="19"/>
-            <w:szCs w:val="19"/>
-          </w:rPr>
-          <w:t xml:space="preserve">github.com/JrKrishh</w:t>
-        </w:r>
-      </w:hyperlink>
-      <w:r>
-        <w:rPr>
-          <w:rFonts w:ascii="Calibri" w:cs="Calibri" w:eastAsia="Calibri" w:hAnsi="Calibri"/>
-          <w:color w:val="6B7280"/>
-          <w:sz w:val="19"/>
-          <w:szCs w:val="19"/>
-        </w:rPr>
-        <w:t xml:space="preserve">   ·   </w:t>
-      </w:r>
-      <w:hyperlink w:history="1" r:id="rIdrm_ts3o1dk2yhh8hdkk5l">
+      <w:hyperlink w:history="1" r:id="rIdumoktyau1day2vamllqe5">
         <w:r>
           <w:rPr>
             <w:rFonts w:ascii="Calibri" w:cs="Calibri" w:eastAsia="Calibri" w:hAnsi="Calibri"/>
@@ -311,26 +291,6 @@
         </w:rPr>
         <w:t xml:space="preserve">  —  TypeScript · Express 5 · PostgreSQL/Drizzle · React 18 · LLM agents</w:t>
       </w:r>
-      <w:r>
-        <w:rPr>
-          <w:rFonts w:ascii="Calibri" w:cs="Calibri" w:eastAsia="Calibri" w:hAnsi="Calibri"/>
-          <w:color w:val="1F2937"/>
-          <w:sz w:val="20"/>
-          <w:szCs w:val="20"/>
-        </w:rPr>
-        <w:t xml:space="preserve">	</w:t>
-      </w:r>
-      <w:hyperlink w:history="1" r:id="rId2cbmsvr_kgn8ozl9cawqa">
-        <w:r>
-          <w:rPr>
-            <w:rFonts w:ascii="Calibri" w:cs="Calibri" w:eastAsia="Calibri" w:hAnsi="Calibri"/>
-            <w:color w:val="0E7490"/>
-            <w:sz w:val="18"/>
-            <w:szCs w:val="18"/>
-          </w:rPr>
-          <w:t xml:space="preserve">github.com/JrKrishh/clawverseworlds</w:t>
-        </w:r>
-      </w:hyperlink>
     </w:p>
     <w:p>
       <w:pPr>
@@ -399,26 +359,6 @@
         </w:rPr>
         <w:t xml:space="preserve">  —  Python · FastAPI · LangGraph/Google ADK · Qdrant + Neo4j · Next.js</w:t>
       </w:r>
-      <w:r>
-        <w:rPr>
-          <w:rFonts w:ascii="Calibri" w:cs="Calibri" w:eastAsia="Calibri" w:hAnsi="Calibri"/>
-          <w:color w:val="1F2937"/>
-          <w:sz w:val="20"/>
-          <w:szCs w:val="20"/>
-        </w:rPr>
-        <w:t xml:space="preserve">	</w:t>
-      </w:r>
-      <w:hyperlink w:history="1" r:id="rIdcsuudfl9e6weouwj1amsw">
-        <w:r>
-          <w:rPr>
-            <w:rFonts w:ascii="Calibri" w:cs="Calibri" w:eastAsia="Calibri" w:hAnsi="Calibri"/>
-            <w:color w:val="0E7490"/>
-            <w:sz w:val="18"/>
-            <w:szCs w:val="18"/>
-          </w:rPr>
-          <w:t xml:space="preserve">github.com/JrKrishh/guy-rick</w:t>
-        </w:r>
-      </w:hyperlink>
     </w:p>
     <w:p>
       <w:pPr>
@@ -487,26 +427,6 @@
         </w:rPr>
         <w:t xml:space="preserve">  —  Python · hybrid retrieval + rerank · Qwen Cloud</w:t>
       </w:r>
-      <w:r>
-        <w:rPr>
-          <w:rFonts w:ascii="Calibri" w:cs="Calibri" w:eastAsia="Calibri" w:hAnsi="Calibri"/>
-          <w:color w:val="1F2937"/>
-          <w:sz w:val="20"/>
-          <w:szCs w:val="20"/>
-        </w:rPr>
-        <w:t xml:space="preserve">	</w:t>
-      </w:r>
-      <w:hyperlink w:history="1" r:id="rIdauhdeulfi128iyij4kpfl">
-        <w:r>
-          <w:rPr>
-            <w:rFonts w:ascii="Calibri" w:cs="Calibri" w:eastAsia="Calibri" w:hAnsi="Calibri"/>
-            <w:color w:val="0E7490"/>
-            <w:sz w:val="18"/>
-            <w:szCs w:val="18"/>
-          </w:rPr>
-          <w:t xml:space="preserve">github.com/JrKrishh/nova-memory</w:t>
-        </w:r>
-      </w:hyperlink>
     </w:p>
     <w:p>
       <w:pPr>
@@ -575,26 +495,6 @@
         </w:rPr>
         <w:t xml:space="preserve">  —  Next.js 15 · TypeScript · Fireworks AI structured output</w:t>
       </w:r>
-      <w:r>
-        <w:rPr>
-          <w:rFonts w:ascii="Calibri" w:cs="Calibri" w:eastAsia="Calibri" w:hAnsi="Calibri"/>
-          <w:color w:val="1F2937"/>
-          <w:sz w:val="20"/>
-          <w:szCs w:val="20"/>
-        </w:rPr>
-        <w:t xml:space="preserve">	</w:t>
-      </w:r>
-      <w:hyperlink w:history="1" r:id="rId7l6i7z-austmkmcfvzoxz">
-        <w:r>
-          <w:rPr>
-            <w:rFonts w:ascii="Calibri" w:cs="Calibri" w:eastAsia="Calibri" w:hAnsi="Calibri"/>
-            <w:color w:val="0E7490"/>
-            <w:sz w:val="18"/>
-            <w:szCs w:val="18"/>
-          </w:rPr>
-          <w:t xml:space="preserve">github.com/JrKrishh/socratic-tutor</w:t>
-        </w:r>
-      </w:hyperlink>
     </w:p>
     <w:p>
       <w:pPr>
@@ -663,26 +563,6 @@
         </w:rPr>
         <w:t xml:space="preserve">  —  TypeScript · Model Context Protocol · published on npm</w:t>
       </w:r>
-      <w:r>
-        <w:rPr>
-          <w:rFonts w:ascii="Calibri" w:cs="Calibri" w:eastAsia="Calibri" w:hAnsi="Calibri"/>
-          <w:color w:val="1F2937"/>
-          <w:sz w:val="20"/>
-          <w:szCs w:val="20"/>
-        </w:rPr>
-        <w:t xml:space="preserve">	</w:t>
-      </w:r>
-      <w:hyperlink w:history="1" r:id="rIdwvbcwtqmbtw-ziv1qefzw">
-        <w:r>
-          <w:rPr>
-            <w:rFonts w:ascii="Calibri" w:cs="Calibri" w:eastAsia="Calibri" w:hAnsi="Calibri"/>
-            <w:color w:val="0E7490"/>
-            <w:sz w:val="18"/>
-            <w:szCs w:val="18"/>
-          </w:rPr>
-          <w:t xml:space="preserve">github.com/JrKrishh/sove-mcp</w:t>
-        </w:r>
-      </w:hyperlink>
     </w:p>
     <w:p>
       <w:pPr>

</xml_diff>

<commit_message>
Point resume header at github.com/notoriousyang, drop clawverseworlds link
Co-Authored-By: Claude Fable 5 <noreply@anthropic.com>
Claude-Session: https://claude.ai/code/session_01MP9tXey6XauUtHmYxv5Guj
</commit_message>
<xml_diff>
--- a/resume/YOGANAND_AI_ENGINEER_RESUME.docx
+++ b/resume/YOGANAND_AI_ENGINEER_RESUME.docx
@@ -51,7 +51,7 @@
         </w:rPr>
         <w:t xml:space="preserve">yogini.nand@gmail.com   ·   +91-80120 70015   ·   </w:t>
       </w:r>
-      <w:hyperlink w:history="1" r:id="rIdumoktyau1day2vamllqe5">
+      <w:hyperlink w:history="1" r:id="rIdglv1bgi2mkby0ol0qrbe5">
         <w:r>
           <w:rPr>
             <w:rFonts w:ascii="Calibri" w:cs="Calibri" w:eastAsia="Calibri" w:hAnsi="Calibri"/>
@@ -59,7 +59,7 @@
             <w:sz w:val="19"/>
             <w:szCs w:val="19"/>
           </w:rPr>
-          <w:t xml:space="preserve">clawverseworlds.vercel.app</w:t>
+          <w:t xml:space="preserve">github.com/notoriousyang</w:t>
         </w:r>
       </w:hyperlink>
     </w:p>
@@ -308,7 +308,7 @@
           <w:sz w:val="20"/>
           <w:szCs w:val="20"/>
         </w:rPr>
-        <w:t xml:space="preserve">Built and deployed a persistent social simulation where autonomous AI agents register via REST API and live independently — chatting, forming friendships and gangs, declaring wars, playing wagered Chess/Tic-Tac-Toe, founding planets, and earning reputation and currency — while humans observe via a real-time dashboard (live at clawverseworlds.vercel.app).</w:t>
+        <w:t xml:space="preserve">Built and deployed a persistent social simulation where autonomous AI agents register via REST API and live independently — chatting, forming friendships and gangs, declaring wars, playing wagered Chess/Tic-Tac-Toe, founding planets, and earning reputation and currency — while humans observe via a real-time dashboard.</w:t>
       </w:r>
     </w:p>
     <w:p>

</xml_diff>